<commit_message>
Journal "Du brauchst kein letztes Gespräch": unter KDP-Mindestseitenzahl behoben
War bei 20 Seiten, unter Amazons Mindestanforderung von 24 Seiten für
Taschenbücher - das war vermutlich der Cover-Fehler beim Hochladen.
Neuen Abschnitt "Eigene Notizen" mit drei Schreiblinien-Seiten am Ende
ergänzt (echter Mehrwert, kein Füllmaterial), jetzt 26 Seiten. Cover-
Rücken entsprechend neu berechnet (1,65mm statt 1,27mm).

Co-Authored-By: Claude Sonnet 5 <noreply@anthropic.com>
Claude-Session: https://claude.ai/code/session_011oFtWvyjvkDdc6K2GcSXHx
</commit_message>
<xml_diff>
--- a/outputs/buch-letztes-gespraech/journal-MANUSKRIPT.docx
+++ b/outputs/buch-letztes-gespraech/journal-MANUSKRIPT.docx
@@ -1548,6 +1548,64 @@
       </w:r>
     </w:p>
     <w:p>
+      <w:pPr>
+        <w:pageBreakBefore/>
+      </w:pPr>
+      <w:r>
+        <w:rPr>
+          <w:b/>
+          <w:sz w:val="34"/>
+        </w:rPr>
+        <w:t>Eigene Notizen</w:t>
+      </w:r>
+    </w:p>
+    <w:p>
+      <w:r>
+        <w:rPr>
+          <w:b w:val="0"/>
+        </w:rPr>
+        <w:t>Platz für alles, was in kein Kästchen weiter oben gepasst hat, für spätere Gedanken oder für ein zweites Durcharbeiten dieses Journals.</w:t>
+      </w:r>
+    </w:p>
+    <w:p>
+      <w:r>
+        <w:rPr>
+          <w:b w:val="0"/>
+        </w:rPr>
+        <w:t>SCHREIBLINIEN·13</w:t>
+      </w:r>
+    </w:p>
+    <w:p>
+      <w:pPr>
+        <w:pageBreakBefore/>
+      </w:pPr>
+      <w:r>
+        <w:rPr>
+          <w:b w:val="0"/>
+        </w:rPr>
+        <w:t>SCHREIBLINIEN·13</w:t>
+      </w:r>
+    </w:p>
+    <w:p>
+      <w:pPr>
+        <w:pageBreakBefore/>
+      </w:pPr>
+      <w:r>
+        <w:rPr>
+          <w:b w:val="0"/>
+        </w:rPr>
+        <w:t>SCHREIBLINIEN·13</w:t>
+      </w:r>
+    </w:p>
+    <w:p>
+      <w:pPr>
+        <w:pageBreakBefore/>
+      </w:pPr>
+      <w:r>
+        <w:t>SCHREIBLINIEN·13</w:t>
+      </w:r>
+    </w:p>
+    <w:p>
       <w:r>
         <w:rPr>
           <w:b/>

</xml_diff>